<commit_message>
docs: update real ai testing materials
</commit_message>
<xml_diff>
--- a/面向外语学习者的“随写随翻”AI工具开发和实践应用-大创申报书.docx
+++ b/面向外语学习者的“随写随翻”AI工具开发和实践应用-大创申报书.docx
@@ -564,7 +564,7 @@
           <w:spacing w:val="0"/>
           <w:color w:val="0E121D"/>
         </w:rPr>
-        <w:t xml:space="preserve">与传统翻译软件只提供结果、专业CAT平台学习门槛较高不同，本项目强调“轻量陪伴，深度成长”。系统支持快速翻译、深度翻译、AI润色、语境说明、语音输入、沉浸写作、历史复盘、表达库、错题库、每日目标、学习热力图、学习报告导出、演示数据加载和本地社群分享等功能。后端采用FastAPI封装大模型调用，设计MockProvider与OpenAIProvider，前端采用React + Vite构建学习工作台，并已通过Docker部署到腾讯云轻量服务器，形成可直接访问的国内演示版本。</w:t>
+        <w:t xml:space="preserve">与传统翻译软件只提供结果、专业CAT平台学习门槛较高不同，本项目强调“轻量陪伴，深度成长”。系统支持快速翻译、深度翻译、AI润色、语境说明、语音输入、沉浸写作、历史复盘、表达库、错题库、每日目标、学习热力图、学习报告导出、演示数据加载和本地社群分享等功能。后端采用FastAPI封装大模型调用，设计MockProvider、OpenAIProvider和OpenAI-compatible Provider，前端采用React + Vite构建学习工作台，并已通过Docker部署到腾讯云轻量服务器，形成可直接访问的国内演示版本。</w:t>
       </w:r>
     </w:p>
     <w:p>
@@ -579,7 +579,7 @@
           <w:spacing w:val="0"/>
           <w:color w:val="0E121D"/>
         </w:rPr>
-        <w:t xml:space="preserve">截至2026年4月30日，项目已完成MVP原型、组件化重构、演示工具、学习报告导出、Vercel国际演示链路和腾讯云国内部署链路。当前版本在mock模式下可稳定演示核心流程，后续将接入真实模型、开展用户测试、优化Prompt效果，并进一步形成技术文档、用户手册、研究报告、软著材料和竞赛展示材料。</w:t>
+        <w:t xml:space="preserve">截至2026年5月3日，项目已完成MVP原型、组件化重构、演示工具、学习报告导出、Vercel国际演示链路和腾讯云国内部署链路，并在腾讯云环境接入DeepSeek真实模型。当前版本已从mock演示进入真实AI小范围测试阶段，后续将继续开展用户测试、优化Prompt效果，并进一步形成技术文档、用户手册、研究报告、软著材料和竞赛展示材料。</w:t>
       </w:r>
     </w:p>
     <w:p>
@@ -1658,20 +1658,20 @@
           <w:spacing w:val="0"/>
           <w:color w:val="0E121D"/>
         </w:rPr>
-        <w:t xml:space="preserve">MockProvider / OpenAIProvider</w:t>
-      </w:r>
-    </w:p>
-    <w:p>
-      <w:pPr/>
-      <w:r>
-        <w:rPr>
-          <w:rFonts w:ascii="Songti SC" w:hAnsi="Songti SC" w:cs="Songti SC"/>
-          <w:sz w:val="32"/>
-          <w:sz-cs w:val="32"/>
-          <w:spacing w:val="0"/>
-          <w:color w:val="0E121D"/>
-        </w:rPr>
-        <w:t xml:space="preserve">默认mock可演示，配置API Key后可接入真实OpenAI模型，后续可扩展通义、文心等。</w:t>
+        <w:t xml:space="preserve">MockProvider / OpenAIProvider / OpenAI-compatible Provider</w:t>
+      </w:r>
+    </w:p>
+    <w:p>
+      <w:pPr/>
+      <w:r>
+        <w:rPr>
+          <w:rFonts w:ascii="Songti SC" w:hAnsi="Songti SC" w:cs="Songti SC"/>
+          <w:sz w:val="32"/>
+          <w:sz-cs w:val="32"/>
+          <w:spacing w:val="0"/>
+          <w:color w:val="0E121D"/>
+        </w:rPr>
+        <w:t xml:space="preserve">默认mock可演示，已支持DeepSeek真实模型，也可扩展OpenAI、DashScope、通义、文心等。</w:t>
       </w:r>
     </w:p>
     <w:p>
@@ -1980,7 +1980,7 @@
           <w:spacing w:val="0"/>
           <w:color w:val="0E121D"/>
         </w:rPr>
-        <w:t xml:space="preserve">mock模式无密钥即可演示，腾讯云国内部署已验证，便于答辩、课程试用和校内推广。</w:t>
+        <w:t xml:space="preserve">mock模式无密钥即可演示，腾讯云国内部署和DeepSeek真实模型接入已验证，便于答辩、课程试用和校内推广。</w:t>
       </w:r>
     </w:p>
     <w:p>

</xml_diff>